<commit_message>
fix(docx): synchronize all chapter docx files in vol9 and vol10 with latest pronouns and translations
</commit_message>
<xml_diff>
--- a/chapters/vol10/02-Chương-2-Lời-hứa-Giáng-sinh.docx
+++ b/chapters/vol10/02-Chương-2-Lời-hứa-Giáng-sinh.docx
@@ -4,8 +4,7 @@
   <w:body>
     <w:p>
       <w:pPr>
-        <w:pStyle w:val="Heading2"/>
-        <w:spacing w:before="400" w:after="280"/>
+        <w:spacing w:before="360" w:after="280"/>
         <w:jc w:val="center"/>
       </w:pPr>
       <w:r>
@@ -20,47 +19,7 @@
     </w:p>
     <w:p>
       <w:pPr>
-        <w:spacing w:after="280" w:before="280"/>
-        <w:jc w:val="center"/>
-      </w:pPr>
-      <w:r>
-        <w:drawing>
-          <wp:inline xmlns:a="http://schemas.openxmlformats.org/drawingml/2006/main" xmlns:pic="http://schemas.openxmlformats.org/drawingml/2006/picture">
-            <wp:extent cx="5029200" cy="1912284"/>
-            <wp:docPr id="1" name="Picture 1"/>
-            <wp:cNvGraphicFramePr>
-              <a:graphicFrameLocks noChangeAspect="1"/>
-            </wp:cNvGraphicFramePr>
-            <a:graphic>
-              <a:graphicData uri="http://schemas.openxmlformats.org/drawingml/2006/picture">
-                <pic:pic>
-                  <pic:nvPicPr>
-                    <pic:cNvPr id="0" name="image_p048_1.jpeg"/>
-                    <pic:cNvPicPr/>
-                  </pic:nvPicPr>
-                  <pic:blipFill>
-                    <a:blip r:embed="rId9"/>
-                    <a:stretch>
-                      <a:fillRect/>
-                    </a:stretch>
-                  </pic:blipFill>
-                  <pic:spPr>
-                    <a:xfrm>
-                      <a:off x="0" y="0"/>
-                      <a:ext cx="5029200" cy="1912284"/>
-                    </a:xfrm>
-                    <a:prstGeom prst="rect"/>
-                  </pic:spPr>
-                </pic:pic>
-              </a:graphicData>
-            </a:graphic>
-          </wp:inline>
-        </w:drawing>
-      </w:r>
-    </w:p>
-    <w:p>
-      <w:pPr>
-        <w:spacing w:line="300" w:lineRule="auto" w:after="120"/>
+        <w:spacing w:before="0" w:after="120" w:line="276" w:lineRule="auto"/>
       </w:pPr>
       <w:r>
         <w:rPr>
@@ -73,7 +32,7 @@
     </w:p>
     <w:p>
       <w:pPr>
-        <w:spacing w:line="300" w:lineRule="auto" w:after="120"/>
+        <w:spacing w:before="0" w:after="120" w:line="276" w:lineRule="auto"/>
       </w:pPr>
       <w:r>
         <w:rPr>
@@ -86,7 +45,7 @@
     </w:p>
     <w:p>
       <w:pPr>
-        <w:spacing w:line="300" w:lineRule="auto" w:after="120"/>
+        <w:spacing w:before="0" w:after="120" w:line="276" w:lineRule="auto"/>
       </w:pPr>
       <w:r>
         <w:rPr>
@@ -99,7 +58,7 @@
     </w:p>
     <w:p>
       <w:pPr>
-        <w:spacing w:line="300" w:lineRule="auto" w:after="120"/>
+        <w:spacing w:before="0" w:after="120" w:line="276" w:lineRule="auto"/>
       </w:pPr>
       <w:r>
         <w:rPr>
@@ -112,7 +71,7 @@
     </w:p>
     <w:p>
       <w:pPr>
-        <w:spacing w:line="300" w:lineRule="auto" w:after="120"/>
+        <w:spacing w:before="0" w:after="120" w:line="276" w:lineRule="auto"/>
       </w:pPr>
       <w:r>
         <w:rPr>
@@ -125,7 +84,7 @@
     </w:p>
     <w:p>
       <w:pPr>
-        <w:spacing w:line="300" w:lineRule="auto" w:after="120"/>
+        <w:spacing w:before="0" w:after="120" w:line="276" w:lineRule="auto"/>
       </w:pPr>
       <w:r>
         <w:rPr>
@@ -138,7 +97,7 @@
     </w:p>
     <w:p>
       <w:pPr>
-        <w:spacing w:line="300" w:lineRule="auto" w:after="120"/>
+        <w:spacing w:before="0" w:after="120" w:line="276" w:lineRule="auto"/>
       </w:pPr>
       <w:r>
         <w:rPr>
@@ -151,7 +110,7 @@
     </w:p>
     <w:p>
       <w:pPr>
-        <w:spacing w:line="300" w:lineRule="auto" w:after="120"/>
+        <w:spacing w:before="0" w:after="120" w:line="276" w:lineRule="auto"/>
       </w:pPr>
       <w:r>
         <w:rPr>
@@ -164,7 +123,7 @@
     </w:p>
     <w:p>
       <w:pPr>
-        <w:spacing w:line="300" w:lineRule="auto" w:after="120"/>
+        <w:spacing w:before="0" w:after="120" w:line="276" w:lineRule="auto"/>
       </w:pPr>
       <w:r>
         <w:rPr>
@@ -177,7 +136,7 @@
     </w:p>
     <w:p>
       <w:pPr>
-        <w:spacing w:line="300" w:lineRule="auto" w:after="120"/>
+        <w:spacing w:before="0" w:after="120" w:line="276" w:lineRule="auto"/>
       </w:pPr>
       <w:r>
         <w:rPr>
@@ -190,7 +149,7 @@
     </w:p>
     <w:p>
       <w:pPr>
-        <w:spacing w:line="300" w:lineRule="auto" w:after="120"/>
+        <w:spacing w:before="0" w:after="120" w:line="276" w:lineRule="auto"/>
       </w:pPr>
       <w:r>
         <w:rPr>
@@ -203,7 +162,7 @@
     </w:p>
     <w:p>
       <w:pPr>
-        <w:spacing w:line="300" w:lineRule="auto" w:after="120"/>
+        <w:spacing w:before="0" w:after="120" w:line="276" w:lineRule="auto"/>
       </w:pPr>
       <w:r>
         <w:rPr>
@@ -216,7 +175,7 @@
     </w:p>
     <w:p>
       <w:pPr>
-        <w:spacing w:line="300" w:lineRule="auto" w:after="120"/>
+        <w:spacing w:before="0" w:after="120" w:line="276" w:lineRule="auto"/>
       </w:pPr>
       <w:r>
         <w:rPr>
@@ -229,7 +188,7 @@
     </w:p>
     <w:p>
       <w:pPr>
-        <w:spacing w:line="300" w:lineRule="auto" w:after="120"/>
+        <w:spacing w:before="0" w:after="120" w:line="276" w:lineRule="auto"/>
       </w:pPr>
       <w:r>
         <w:rPr>
@@ -242,7 +201,7 @@
     </w:p>
     <w:p>
       <w:pPr>
-        <w:spacing w:line="300" w:lineRule="auto" w:after="120"/>
+        <w:spacing w:before="0" w:after="120" w:line="276" w:lineRule="auto"/>
       </w:pPr>
       <w:r>
         <w:rPr>
@@ -255,7 +214,7 @@
     </w:p>
     <w:p>
       <w:pPr>
-        <w:spacing w:line="300" w:lineRule="auto" w:after="120"/>
+        <w:spacing w:before="0" w:after="120" w:line="276" w:lineRule="auto"/>
       </w:pPr>
       <w:r>
         <w:rPr>
@@ -268,7 +227,7 @@
     </w:p>
     <w:p>
       <w:pPr>
-        <w:spacing w:line="300" w:lineRule="auto" w:after="120"/>
+        <w:spacing w:before="0" w:after="120" w:line="276" w:lineRule="auto"/>
       </w:pPr>
       <w:r>
         <w:rPr>
@@ -281,7 +240,7 @@
     </w:p>
     <w:p>
       <w:pPr>
-        <w:spacing w:line="300" w:lineRule="auto" w:after="120"/>
+        <w:spacing w:before="0" w:after="120" w:line="276" w:lineRule="auto"/>
       </w:pPr>
       <w:r>
         <w:rPr>
@@ -294,7 +253,7 @@
     </w:p>
     <w:p>
       <w:pPr>
-        <w:spacing w:line="300" w:lineRule="auto" w:after="120"/>
+        <w:spacing w:before="0" w:after="120" w:line="276" w:lineRule="auto"/>
       </w:pPr>
       <w:r>
         <w:rPr>
@@ -307,7 +266,7 @@
     </w:p>
     <w:p>
       <w:pPr>
-        <w:spacing w:line="300" w:lineRule="auto" w:after="120"/>
+        <w:spacing w:before="0" w:after="120" w:line="276" w:lineRule="auto"/>
       </w:pPr>
       <w:r>
         <w:rPr>
@@ -320,7 +279,7 @@
     </w:p>
     <w:p>
       <w:pPr>
-        <w:spacing w:line="300" w:lineRule="auto" w:after="120"/>
+        <w:spacing w:before="0" w:after="120" w:line="276" w:lineRule="auto"/>
       </w:pPr>
       <w:r>
         <w:rPr>
@@ -333,7 +292,7 @@
     </w:p>
     <w:p>
       <w:pPr>
-        <w:spacing w:line="300" w:lineRule="auto" w:after="120"/>
+        <w:spacing w:before="0" w:after="120" w:line="276" w:lineRule="auto"/>
       </w:pPr>
       <w:r>
         <w:rPr>
@@ -346,7 +305,7 @@
     </w:p>
     <w:p>
       <w:pPr>
-        <w:spacing w:line="300" w:lineRule="auto" w:after="120"/>
+        <w:spacing w:before="0" w:after="120" w:line="276" w:lineRule="auto"/>
       </w:pPr>
       <w:r>
         <w:rPr>
@@ -354,12 +313,12 @@
           <w:color w:val="222222"/>
           <w:sz w:val="24"/>
         </w:rPr>
-        <w:t>“Điểm số của cậu đã tiến bộ hơn so với lần trước rồi, và cậu cũng đã quen dần với việc giải các dạng bài tập rồi. Đó là một sự tiến bộ đấy ạ.”</w:t>
+        <w:t>“Điểm số của cậu đã tiến bộ hơn so với lần trước rồi, và cậu cũng đã quen dần với việc giải các dạng bài tập rồi. Đó là một sự tiến bộ đấy chứ.”</w:t>
       </w:r>
     </w:p>
     <w:p>
       <w:pPr>
-        <w:spacing w:line="300" w:lineRule="auto" w:after="120"/>
+        <w:spacing w:before="0" w:after="120" w:line="276" w:lineRule="auto"/>
       </w:pPr>
       <w:r>
         <w:rPr>
@@ -372,7 +331,7 @@
     </w:p>
     <w:p>
       <w:pPr>
-        <w:spacing w:line="300" w:lineRule="auto" w:after="120"/>
+        <w:spacing w:before="0" w:after="120" w:line="276" w:lineRule="auto"/>
       </w:pPr>
       <w:r>
         <w:rPr>
@@ -385,7 +344,7 @@
     </w:p>
     <w:p>
       <w:pPr>
-        <w:spacing w:line="300" w:lineRule="auto" w:after="120"/>
+        <w:spacing w:before="0" w:after="120" w:line="276" w:lineRule="auto"/>
       </w:pPr>
       <w:r>
         <w:rPr>
@@ -398,7 +357,7 @@
     </w:p>
     <w:p>
       <w:pPr>
-        <w:spacing w:line="300" w:lineRule="auto" w:after="120"/>
+        <w:spacing w:before="0" w:after="120" w:line="276" w:lineRule="auto"/>
       </w:pPr>
       <w:r>
         <w:rPr>
@@ -411,7 +370,7 @@
     </w:p>
     <w:p>
       <w:pPr>
-        <w:spacing w:line="300" w:lineRule="auto" w:after="120"/>
+        <w:spacing w:before="0" w:after="120" w:line="276" w:lineRule="auto"/>
       </w:pPr>
       <w:r>
         <w:rPr>
@@ -424,7 +383,7 @@
     </w:p>
     <w:p>
       <w:pPr>
-        <w:spacing w:line="300" w:lineRule="auto" w:after="120"/>
+        <w:spacing w:before="0" w:after="120" w:line="276" w:lineRule="auto"/>
       </w:pPr>
       <w:r>
         <w:rPr>
@@ -437,7 +396,7 @@
     </w:p>
     <w:p>
       <w:pPr>
-        <w:spacing w:line="300" w:lineRule="auto" w:after="120"/>
+        <w:spacing w:before="0" w:after="120" w:line="276" w:lineRule="auto"/>
       </w:pPr>
       <w:r>
         <w:rPr>
@@ -445,12 +404,12 @@
           <w:color w:val="222222"/>
           <w:sz w:val="24"/>
         </w:rPr>
-        <w:t>“Đương nhiên rồi ạ. Thành Rome đâu thể xây xong trong một ngày, như người ta vẫn thường nói đấy thôi. Nếu cậu chịu khó nhồi kiến thức mỗi tối, tài liệu học tập cuối cùng cũng sẽ được khắc sâu vào trong trí nhớ của cậu thôi.”</w:t>
+        <w:t>“Đương nhiên rồi mà. Thành Rome đâu thể xây xong trong một ngày, như người ta vẫn thường nói đấy thôi. Nếu cậu chịu khó nhồi kiến thức mỗi tối, tài liệu học tập cuối cùng cũng sẽ được khắc sâu vào trong trí nhớ của cậu thôi.”</w:t>
       </w:r>
     </w:p>
     <w:p>
       <w:pPr>
-        <w:spacing w:line="300" w:lineRule="auto" w:after="120"/>
+        <w:spacing w:before="0" w:after="120" w:line="276" w:lineRule="auto"/>
       </w:pPr>
       <w:r>
         <w:rPr>
@@ -463,7 +422,7 @@
     </w:p>
     <w:p>
       <w:pPr>
-        <w:spacing w:line="300" w:lineRule="auto" w:after="120"/>
+        <w:spacing w:before="0" w:after="120" w:line="276" w:lineRule="auto"/>
       </w:pPr>
       <w:r>
         <w:rPr>
@@ -476,7 +435,7 @@
     </w:p>
     <w:p>
       <w:pPr>
-        <w:spacing w:line="300" w:lineRule="auto" w:after="120"/>
+        <w:spacing w:before="0" w:after="120" w:line="276" w:lineRule="auto"/>
       </w:pPr>
       <w:r>
         <w:rPr>
@@ -489,7 +448,7 @@
     </w:p>
     <w:p>
       <w:pPr>
-        <w:spacing w:line="300" w:lineRule="auto" w:after="120"/>
+        <w:spacing w:before="0" w:after="120" w:line="276" w:lineRule="auto"/>
       </w:pPr>
       <w:r>
         <w:rPr>
@@ -502,7 +461,7 @@
     </w:p>
     <w:p>
       <w:pPr>
-        <w:spacing w:line="300" w:lineRule="auto" w:after="120"/>
+        <w:spacing w:before="0" w:after="120" w:line="276" w:lineRule="auto"/>
       </w:pPr>
       <w:r>
         <w:rPr>
@@ -515,7 +474,7 @@
     </w:p>
     <w:p>
       <w:pPr>
-        <w:spacing w:line="300" w:lineRule="auto" w:after="120"/>
+        <w:spacing w:before="0" w:after="120" w:line="276" w:lineRule="auto"/>
       </w:pPr>
       <w:r>
         <w:rPr>
@@ -528,7 +487,7 @@
     </w:p>
     <w:p>
       <w:pPr>
-        <w:spacing w:line="300" w:lineRule="auto" w:after="120"/>
+        <w:spacing w:before="0" w:after="120" w:line="276" w:lineRule="auto"/>
       </w:pPr>
       <w:r>
         <w:rPr>
@@ -541,7 +500,7 @@
     </w:p>
     <w:p>
       <w:pPr>
-        <w:spacing w:line="300" w:lineRule="auto" w:after="120"/>
+        <w:spacing w:before="0" w:after="120" w:line="276" w:lineRule="auto"/>
       </w:pPr>
       <w:r>
         <w:rPr>
@@ -554,7 +513,7 @@
     </w:p>
     <w:p>
       <w:pPr>
-        <w:spacing w:line="300" w:lineRule="auto" w:after="120"/>
+        <w:spacing w:before="0" w:after="120" w:line="276" w:lineRule="auto"/>
       </w:pPr>
       <w:r>
         <w:rPr>
@@ -567,7 +526,7 @@
     </w:p>
     <w:p>
       <w:pPr>
-        <w:spacing w:line="300" w:lineRule="auto" w:after="120"/>
+        <w:spacing w:before="0" w:after="120" w:line="276" w:lineRule="auto"/>
       </w:pPr>
       <w:r>
         <w:rPr>
@@ -580,7 +539,7 @@
     </w:p>
     <w:p>
       <w:pPr>
-        <w:spacing w:line="300" w:lineRule="auto" w:after="120"/>
+        <w:spacing w:before="0" w:after="120" w:line="276" w:lineRule="auto"/>
       </w:pPr>
       <w:r>
         <w:rPr>
@@ -593,7 +552,7 @@
     </w:p>
     <w:p>
       <w:pPr>
-        <w:spacing w:line="300" w:lineRule="auto" w:after="120"/>
+        <w:spacing w:before="0" w:after="120" w:line="276" w:lineRule="auto"/>
       </w:pPr>
       <w:r>
         <w:rPr>
@@ -606,7 +565,7 @@
     </w:p>
     <w:p>
       <w:pPr>
-        <w:spacing w:line="300" w:lineRule="auto" w:after="120"/>
+        <w:spacing w:before="0" w:after="120" w:line="276" w:lineRule="auto"/>
       </w:pPr>
       <w:r>
         <w:rPr>
@@ -619,7 +578,7 @@
     </w:p>
     <w:p>
       <w:pPr>
-        <w:spacing w:line="300" w:lineRule="auto" w:after="120"/>
+        <w:spacing w:before="0" w:after="120" w:line="276" w:lineRule="auto"/>
       </w:pPr>
       <w:r>
         <w:rPr>
@@ -632,7 +591,7 @@
     </w:p>
     <w:p>
       <w:pPr>
-        <w:spacing w:line="300" w:lineRule="auto" w:after="120"/>
+        <w:spacing w:before="0" w:after="120" w:line="276" w:lineRule="auto"/>
       </w:pPr>
       <w:r>
         <w:rPr>
@@ -645,7 +604,7 @@
     </w:p>
     <w:p>
       <w:pPr>
-        <w:spacing w:line="300" w:lineRule="auto" w:after="120"/>
+        <w:spacing w:before="0" w:after="120" w:line="276" w:lineRule="auto"/>
       </w:pPr>
       <w:r>
         <w:rPr>
@@ -658,7 +617,7 @@
     </w:p>
     <w:p>
       <w:pPr>
-        <w:spacing w:line="300" w:lineRule="auto" w:after="120"/>
+        <w:spacing w:before="0" w:after="120" w:line="276" w:lineRule="auto"/>
       </w:pPr>
       <w:r>
         <w:rPr>
@@ -671,7 +630,7 @@
     </w:p>
     <w:p>
       <w:pPr>
-        <w:spacing w:line="300" w:lineRule="auto" w:after="120"/>
+        <w:spacing w:before="0" w:after="120" w:line="276" w:lineRule="auto"/>
       </w:pPr>
       <w:r>
         <w:rPr>
@@ -684,7 +643,7 @@
     </w:p>
     <w:p>
       <w:pPr>
-        <w:spacing w:line="300" w:lineRule="auto" w:after="120"/>
+        <w:spacing w:before="0" w:after="120" w:line="276" w:lineRule="auto"/>
       </w:pPr>
       <w:r>
         <w:rPr>
@@ -697,7 +656,7 @@
     </w:p>
     <w:p>
       <w:pPr>
-        <w:spacing w:line="300" w:lineRule="auto" w:after="120"/>
+        <w:spacing w:before="0" w:after="120" w:line="276" w:lineRule="auto"/>
       </w:pPr>
       <w:r>
         <w:rPr>
@@ -710,7 +669,7 @@
     </w:p>
     <w:p>
       <w:pPr>
-        <w:spacing w:line="300" w:lineRule="auto" w:after="120"/>
+        <w:spacing w:before="0" w:after="120" w:line="276" w:lineRule="auto"/>
       </w:pPr>
       <w:r>
         <w:rPr>
@@ -723,7 +682,7 @@
     </w:p>
     <w:p>
       <w:pPr>
-        <w:spacing w:line="300" w:lineRule="auto" w:after="120"/>
+        <w:spacing w:before="0" w:after="120" w:line="276" w:lineRule="auto"/>
       </w:pPr>
       <w:r>
         <w:rPr>
@@ -736,7 +695,7 @@
     </w:p>
     <w:p>
       <w:pPr>
-        <w:spacing w:line="300" w:lineRule="auto" w:after="120"/>
+        <w:spacing w:before="0" w:after="120" w:line="276" w:lineRule="auto"/>
       </w:pPr>
       <w:r>
         <w:rPr>
@@ -749,7 +708,7 @@
     </w:p>
     <w:p>
       <w:pPr>
-        <w:spacing w:line="300" w:lineRule="auto" w:after="120"/>
+        <w:spacing w:before="0" w:after="120" w:line="276" w:lineRule="auto"/>
       </w:pPr>
       <w:r>
         <w:rPr>
@@ -762,7 +721,7 @@
     </w:p>
     <w:p>
       <w:pPr>
-        <w:spacing w:line="300" w:lineRule="auto" w:after="120"/>
+        <w:spacing w:before="0" w:after="120" w:line="276" w:lineRule="auto"/>
       </w:pPr>
       <w:r>
         <w:rPr>
@@ -775,7 +734,7 @@
     </w:p>
     <w:p>
       <w:pPr>
-        <w:spacing w:line="300" w:lineRule="auto" w:after="120"/>
+        <w:spacing w:before="0" w:after="120" w:line="276" w:lineRule="auto"/>
       </w:pPr>
       <w:r>
         <w:rPr>
@@ -788,7 +747,7 @@
     </w:p>
     <w:p>
       <w:pPr>
-        <w:spacing w:line="300" w:lineRule="auto" w:after="120"/>
+        <w:spacing w:before="0" w:after="120" w:line="276" w:lineRule="auto"/>
       </w:pPr>
       <w:r>
         <w:rPr>
@@ -801,7 +760,7 @@
     </w:p>
     <w:p>
       <w:pPr>
-        <w:spacing w:line="300" w:lineRule="auto" w:after="120"/>
+        <w:spacing w:before="0" w:after="120" w:line="276" w:lineRule="auto"/>
       </w:pPr>
       <w:r>
         <w:rPr>
@@ -814,7 +773,7 @@
     </w:p>
     <w:p>
       <w:pPr>
-        <w:spacing w:line="300" w:lineRule="auto" w:after="120"/>
+        <w:spacing w:before="0" w:after="120" w:line="276" w:lineRule="auto"/>
       </w:pPr>
       <w:r>
         <w:rPr>
@@ -827,7 +786,7 @@
     </w:p>
     <w:p>
       <w:pPr>
-        <w:spacing w:line="300" w:lineRule="auto" w:after="120"/>
+        <w:spacing w:before="0" w:after="120" w:line="276" w:lineRule="auto"/>
       </w:pPr>
       <w:r>
         <w:rPr>
@@ -840,7 +799,7 @@
     </w:p>
     <w:p>
       <w:pPr>
-        <w:spacing w:line="300" w:lineRule="auto" w:after="120"/>
+        <w:spacing w:before="0" w:after="120" w:line="276" w:lineRule="auto"/>
       </w:pPr>
       <w:r>
         <w:rPr>
@@ -848,12 +807,12 @@
           <w:color w:val="222222"/>
           <w:sz w:val="24"/>
         </w:rPr>
-        <w:t>“Thôi nào, thôi nào, Amane-kun. Cậu không được thô bạo thế đâu ạ.”</w:t>
+        <w:t>“Thôi nào, thôi nào, Amane. Cậu không được thô bạo thế đâu ạ.”</w:t>
       </w:r>
     </w:p>
     <w:p>
       <w:pPr>
-        <w:spacing w:line="300" w:lineRule="auto" w:after="120"/>
+        <w:spacing w:before="0" w:after="120" w:line="276" w:lineRule="auto"/>
       </w:pPr>
       <w:r>
         <w:rPr>
@@ -866,7 +825,7 @@
     </w:p>
     <w:p>
       <w:pPr>
-        <w:spacing w:line="300" w:lineRule="auto" w:after="120"/>
+        <w:spacing w:before="0" w:after="120" w:line="276" w:lineRule="auto"/>
       </w:pPr>
       <w:r>
         <w:rPr>
@@ -879,7 +838,7 @@
     </w:p>
     <w:p>
       <w:pPr>
-        <w:spacing w:line="300" w:lineRule="auto" w:after="120"/>
+        <w:spacing w:before="0" w:after="120" w:line="276" w:lineRule="auto"/>
       </w:pPr>
       <w:r>
         <w:rPr>
@@ -892,7 +851,7 @@
     </w:p>
     <w:p>
       <w:pPr>
-        <w:spacing w:line="300" w:lineRule="auto" w:after="120"/>
+        <w:spacing w:before="0" w:after="120" w:line="276" w:lineRule="auto"/>
       </w:pPr>
       <w:r>
         <w:rPr>
@@ -900,12 +859,12 @@
           <w:color w:val="222222"/>
           <w:sz w:val="24"/>
         </w:rPr>
-        <w:t>“Thường thì lúc nào Ikkun cũng trêu chọc quá đà. Mày chẳng bao giờ thực sự nghiêm túc cả Amane, nên tao chắc là mày chỉ đang giỡn một chút thôi đúng không,” Chitose nói.</w:t>
+        <w:t>“Thường thì lúc nào Ikkun cũng trêu chọc quá đà. Cậu chẳng bao giờ thực sự nghiêm túc cả Amane, nên tớ chắc là cậu chỉ đang giỡn một chút thôi đúng không,” Chitose nói.</w:t>
       </w:r>
     </w:p>
     <w:p>
       <w:pPr>
-        <w:spacing w:line="300" w:lineRule="auto" w:after="120"/>
+        <w:spacing w:before="0" w:after="120" w:line="276" w:lineRule="auto"/>
       </w:pPr>
       <w:r>
         <w:rPr>
@@ -918,7 +877,7 @@
     </w:p>
     <w:p>
       <w:pPr>
-        <w:spacing w:line="300" w:lineRule="auto" w:after="120"/>
+        <w:spacing w:before="0" w:after="120" w:line="276" w:lineRule="auto"/>
       </w:pPr>
       <w:r>
         <w:rPr>
@@ -931,7 +890,7 @@
     </w:p>
     <w:p>
       <w:pPr>
-        <w:spacing w:line="300" w:lineRule="auto" w:after="120"/>
+        <w:spacing w:before="0" w:after="120" w:line="276" w:lineRule="auto"/>
       </w:pPr>
       <w:r>
         <w:rPr>
@@ -939,12 +898,12 @@
           <w:color w:val="222222"/>
           <w:sz w:val="24"/>
         </w:rPr>
-        <w:t>Vậy là cô nàng không thèm đứng về phía bạn trai mình cũng chẳng sao à? Amane thoáng nghĩ trong giây lát, nhưng trước khi cậu kịp nói điều gì, Chitose, dường như đọc được suy nghĩ trong đầu cậu, liền xen vào bằng một nhận xét điềm tĩnh đến bất ngờ, khác hẳn với vẻ nhí nhảnh vui tươi thường ngày của cô: “Ikkun đôi khi đi quá giới hạn. Cậu ấy gần như muốn mày đánh lại nó luôn ấy.”</w:t>
+        <w:t>Vậy là cô nàng không thèm đứng về phía bạn trai mình cũng chẳng sao à? Amane thoáng nghĩ trong giây lát, nhưng trước khi cậu kịp nói điều gì, Chitose, dường như đọc được suy nghĩ trong đầu cậu, liền xen vào bằng một nhận xét điềm tĩnh đến bất ngờ, khác hẳn với vẻ nhí nhảnh vui tươi thường ngày của cô: “Ikkun đôi khi đi quá giới hạn. Cậu ấy gần như muốn cậu phản đòn lại cậu ấy luôn ấy.”</w:t>
       </w:r>
     </w:p>
     <w:p>
       <w:pPr>
-        <w:spacing w:line="300" w:lineRule="auto" w:after="120"/>
+        <w:spacing w:before="0" w:after="120" w:line="276" w:lineRule="auto"/>
       </w:pPr>
       <w:r>
         <w:rPr>
@@ -957,7 +916,7 @@
     </w:p>
     <w:p>
       <w:pPr>
-        <w:spacing w:line="300" w:lineRule="auto" w:after="120"/>
+        <w:spacing w:before="0" w:after="120" w:line="276" w:lineRule="auto"/>
       </w:pPr>
       <w:r>
         <w:rPr>
@@ -970,7 +929,7 @@
     </w:p>
     <w:p>
       <w:pPr>
-        <w:spacing w:line="300" w:lineRule="auto" w:after="120"/>
+        <w:spacing w:before="0" w:after="120" w:line="276" w:lineRule="auto"/>
       </w:pPr>
       <w:r>
         <w:rPr>
@@ -978,12 +937,12 @@
           <w:color w:val="222222"/>
           <w:sz w:val="24"/>
         </w:rPr>
-        <w:t>“Akazawa-san, cậu cũng nên cố gắng tránh trêu chọc Amane-kun quá nhiều nhé. Cậu ấy có xu hướng cư xử như trẻ con mỗi khi ở cạnh cậu đấy ạ,” Mahiru dịu dàng nhận xét.</w:t>
+        <w:t>“Akazawa-kun, cậu cũng nên cố gắng tránh trêu chọc Amane quá nhiều nhé. Cậu ấy có xu hướng cư xử như trẻ con mỗi khi ở cạnh cậu đấy ạ,” Mahiru dịu dàng nhận xét.</w:t>
       </w:r>
     </w:p>
     <w:p>
       <w:pPr>
-        <w:spacing w:line="300" w:lineRule="auto" w:after="120"/>
+        <w:spacing w:before="0" w:after="120" w:line="276" w:lineRule="auto"/>
       </w:pPr>
       <w:r>
         <w:rPr>
@@ -996,7 +955,7 @@
     </w:p>
     <w:p>
       <w:pPr>
-        <w:spacing w:line="300" w:lineRule="auto" w:after="120"/>
+        <w:spacing w:before="0" w:after="120" w:line="276" w:lineRule="auto"/>
       </w:pPr>
       <w:r>
         <w:rPr>
@@ -1009,7 +968,7 @@
     </w:p>
     <w:p>
       <w:pPr>
-        <w:spacing w:line="300" w:lineRule="auto" w:after="120"/>
+        <w:spacing w:before="0" w:after="120" w:line="276" w:lineRule="auto"/>
       </w:pPr>
       <w:r>
         <w:rPr>
@@ -1022,7 +981,7 @@
     </w:p>
     <w:p>
       <w:pPr>
-        <w:spacing w:line="300" w:lineRule="auto" w:after="120"/>
+        <w:spacing w:before="0" w:after="120" w:line="276" w:lineRule="auto"/>
       </w:pPr>
       <w:r>
         <w:rPr>
@@ -1035,7 +994,7 @@
     </w:p>
     <w:p>
       <w:pPr>
-        <w:spacing w:line="300" w:lineRule="auto" w:after="120"/>
+        <w:spacing w:before="0" w:after="120" w:line="276" w:lineRule="auto"/>
       </w:pPr>
       <w:r>
         <w:rPr>
@@ -1048,7 +1007,7 @@
     </w:p>
     <w:p>
       <w:pPr>
-        <w:spacing w:line="300" w:lineRule="auto" w:after="120"/>
+        <w:spacing w:before="0" w:after="120" w:line="276" w:lineRule="auto"/>
       </w:pPr>
       <w:r>
         <w:rPr>
@@ -1061,7 +1020,7 @@
     </w:p>
     <w:p>
       <w:pPr>
-        <w:spacing w:line="300" w:lineRule="auto" w:after="120"/>
+        <w:spacing w:before="0" w:after="120" w:line="276" w:lineRule="auto"/>
       </w:pPr>
       <w:r>
         <w:rPr>
@@ -1074,7 +1033,7 @@
     </w:p>
     <w:p>
       <w:pPr>
-        <w:spacing w:line="300" w:lineRule="auto" w:after="120"/>
+        <w:spacing w:before="0" w:after="120" w:line="276" w:lineRule="auto"/>
       </w:pPr>
       <w:r>
         <w:rPr>
@@ -1087,7 +1046,7 @@
     </w:p>
     <w:p>
       <w:pPr>
-        <w:spacing w:line="300" w:lineRule="auto" w:after="120"/>
+        <w:spacing w:before="0" w:after="120" w:line="276" w:lineRule="auto"/>
       </w:pPr>
       <w:r>
         <w:rPr>
@@ -1100,7 +1059,7 @@
     </w:p>
     <w:p>
       <w:pPr>
-        <w:spacing w:line="300" w:lineRule="auto" w:after="120"/>
+        <w:spacing w:before="0" w:after="120" w:line="276" w:lineRule="auto"/>
       </w:pPr>
       <w:r>
         <w:rPr>
@@ -1113,7 +1072,7 @@
     </w:p>
     <w:p>
       <w:pPr>
-        <w:spacing w:line="300" w:lineRule="auto" w:after="120"/>
+        <w:spacing w:before="0" w:after="120" w:line="276" w:lineRule="auto"/>
       </w:pPr>
       <w:r>
         <w:rPr>
@@ -1126,7 +1085,7 @@
     </w:p>
     <w:p>
       <w:pPr>
-        <w:spacing w:line="300" w:lineRule="auto" w:after="120"/>
+        <w:spacing w:before="0" w:after="120" w:line="276" w:lineRule="auto"/>
       </w:pPr>
       <w:r>
         <w:rPr>
@@ -1139,7 +1098,7 @@
     </w:p>
     <w:p>
       <w:pPr>
-        <w:spacing w:line="300" w:lineRule="auto" w:after="120"/>
+        <w:spacing w:before="0" w:after="120" w:line="276" w:lineRule="auto"/>
       </w:pPr>
       <w:r>
         <w:rPr>
@@ -1152,7 +1111,7 @@
     </w:p>
     <w:p>
       <w:pPr>
-        <w:spacing w:line="300" w:lineRule="auto" w:after="120"/>
+        <w:spacing w:before="0" w:after="120" w:line="276" w:lineRule="auto"/>
       </w:pPr>
       <w:r>
         <w:rPr>
@@ -1165,7 +1124,7 @@
     </w:p>
     <w:p>
       <w:pPr>
-        <w:spacing w:line="300" w:lineRule="auto" w:after="120"/>
+        <w:spacing w:before="0" w:after="120" w:line="276" w:lineRule="auto"/>
       </w:pPr>
       <w:r>
         <w:rPr>
@@ -1178,7 +1137,7 @@
     </w:p>
     <w:p>
       <w:pPr>
-        <w:spacing w:line="300" w:lineRule="auto" w:after="120"/>
+        <w:spacing w:before="0" w:after="120" w:line="276" w:lineRule="auto"/>
       </w:pPr>
       <w:r>
         <w:rPr>
@@ -1191,7 +1150,7 @@
     </w:p>
     <w:p>
       <w:pPr>
-        <w:spacing w:line="300" w:lineRule="auto" w:after="120"/>
+        <w:spacing w:before="0" w:after="120" w:line="276" w:lineRule="auto"/>
       </w:pPr>
       <w:r>
         <w:rPr>
@@ -1204,7 +1163,7 @@
     </w:p>
     <w:p>
       <w:pPr>
-        <w:spacing w:line="300" w:lineRule="auto" w:after="120"/>
+        <w:spacing w:before="0" w:after="120" w:line="276" w:lineRule="auto"/>
       </w:pPr>
       <w:r>
         <w:rPr>
@@ -1217,7 +1176,7 @@
     </w:p>
     <w:p>
       <w:pPr>
-        <w:spacing w:line="300" w:lineRule="auto" w:after="120"/>
+        <w:spacing w:before="0" w:after="120" w:line="276" w:lineRule="auto"/>
       </w:pPr>
       <w:r>
         <w:rPr>
@@ -1230,7 +1189,7 @@
     </w:p>
     <w:p>
       <w:pPr>
-        <w:spacing w:line="300" w:lineRule="auto" w:after="120"/>
+        <w:spacing w:before="0" w:after="120" w:line="276" w:lineRule="auto"/>
       </w:pPr>
       <w:r>
         <w:rPr>
@@ -1243,7 +1202,7 @@
     </w:p>
     <w:p>
       <w:pPr>
-        <w:spacing w:line="300" w:lineRule="auto" w:after="120"/>
+        <w:spacing w:before="0" w:after="120" w:line="276" w:lineRule="auto"/>
       </w:pPr>
       <w:r>
         <w:rPr>
@@ -1256,7 +1215,7 @@
     </w:p>
     <w:p>
       <w:pPr>
-        <w:spacing w:line="300" w:lineRule="auto" w:after="120"/>
+        <w:spacing w:before="0" w:after="120" w:line="276" w:lineRule="auto"/>
       </w:pPr>
       <w:r>
         <w:rPr>
@@ -1269,7 +1228,7 @@
     </w:p>
     <w:p>
       <w:pPr>
-        <w:spacing w:line="300" w:lineRule="auto" w:after="120"/>
+        <w:spacing w:before="0" w:after="120" w:line="276" w:lineRule="auto"/>
       </w:pPr>
       <w:r>
         <w:rPr>
@@ -1277,12 +1236,12 @@
           <w:color w:val="222222"/>
           <w:sz w:val="24"/>
         </w:rPr>
-        <w:t>“Amane-kun đừng có hùa theo cậu ấy chứ ạ.”</w:t>
+        <w:t>“Amane đừng có hùa theo cậu ấy chứ ạ.”</w:t>
       </w:r>
     </w:p>
     <w:p>
       <w:pPr>
-        <w:spacing w:line="300" w:lineRule="auto" w:after="120"/>
+        <w:spacing w:before="0" w:after="120" w:line="276" w:lineRule="auto"/>
       </w:pPr>
       <w:r>
         <w:rPr>
@@ -1295,7 +1254,7 @@
     </w:p>
     <w:p>
       <w:pPr>
-        <w:spacing w:line="300" w:lineRule="auto" w:after="120"/>
+        <w:spacing w:before="0" w:after="120" w:line="276" w:lineRule="auto"/>
       </w:pPr>
       <w:r>
         <w:rPr>
@@ -1308,7 +1267,7 @@
     </w:p>
     <w:p>
       <w:pPr>
-        <w:spacing w:line="300" w:lineRule="auto" w:after="120"/>
+        <w:spacing w:before="0" w:after="120" w:line="276" w:lineRule="auto"/>
       </w:pPr>
       <w:r>
         <w:rPr>
@@ -1321,7 +1280,7 @@
     </w:p>
     <w:p>
       <w:pPr>
-        <w:spacing w:line="300" w:lineRule="auto" w:after="120"/>
+        <w:spacing w:before="0" w:after="120" w:line="276" w:lineRule="auto"/>
       </w:pPr>
       <w:r>
         <w:rPr>
@@ -1334,7 +1293,7 @@
     </w:p>
     <w:p>
       <w:pPr>
-        <w:spacing w:line="300" w:lineRule="auto" w:after="120"/>
+        <w:spacing w:before="0" w:after="120" w:line="276" w:lineRule="auto"/>
       </w:pPr>
       <w:r>
         <w:rPr>
@@ -1347,7 +1306,7 @@
     </w:p>
     <w:p>
       <w:pPr>
-        <w:spacing w:line="300" w:lineRule="auto" w:after="120"/>
+        <w:spacing w:before="0" w:after="120" w:line="276" w:lineRule="auto"/>
       </w:pPr>
       <w:r>
         <w:rPr>
@@ -1360,7 +1319,7 @@
     </w:p>
     <w:p>
       <w:pPr>
-        <w:spacing w:line="300" w:lineRule="auto" w:after="120"/>
+        <w:spacing w:before="0" w:after="120" w:line="276" w:lineRule="auto"/>
       </w:pPr>
       <w:r>
         <w:rPr>
@@ -1373,7 +1332,7 @@
     </w:p>
     <w:p>
       <w:pPr>
-        <w:spacing w:line="300" w:lineRule="auto" w:after="120"/>
+        <w:spacing w:before="0" w:after="120" w:line="276" w:lineRule="auto"/>
       </w:pPr>
       <w:r>
         <w:rPr>
@@ -1386,7 +1345,7 @@
     </w:p>
     <w:p>
       <w:pPr>
-        <w:spacing w:line="300" w:lineRule="auto" w:after="120"/>
+        <w:spacing w:before="0" w:after="120" w:line="276" w:lineRule="auto"/>
       </w:pPr>
       <w:r>
         <w:rPr>
@@ -1399,7 +1358,7 @@
     </w:p>
     <w:p>
       <w:pPr>
-        <w:spacing w:line="300" w:lineRule="auto" w:after="120"/>
+        <w:spacing w:before="0" w:after="120" w:line="276" w:lineRule="auto"/>
       </w:pPr>
       <w:r>
         <w:rPr>
@@ -1412,7 +1371,7 @@
     </w:p>
     <w:p>
       <w:pPr>
-        <w:spacing w:line="300" w:lineRule="auto" w:after="120"/>
+        <w:spacing w:before="0" w:after="120" w:line="276" w:lineRule="auto"/>
       </w:pPr>
       <w:r>
         <w:rPr>
@@ -1425,7 +1384,7 @@
     </w:p>
     <w:p>
       <w:pPr>
-        <w:spacing w:line="300" w:lineRule="auto" w:after="120"/>
+        <w:spacing w:before="0" w:after="120" w:line="276" w:lineRule="auto"/>
       </w:pPr>
       <w:r>
         <w:rPr>
@@ -1438,7 +1397,7 @@
     </w:p>
     <w:p>
       <w:pPr>
-        <w:spacing w:line="300" w:lineRule="auto" w:after="120"/>
+        <w:spacing w:before="0" w:after="120" w:line="276" w:lineRule="auto"/>
       </w:pPr>
       <w:r>
         <w:rPr>
@@ -1451,7 +1410,7 @@
     </w:p>
     <w:p>
       <w:pPr>
-        <w:spacing w:line="300" w:lineRule="auto" w:after="120"/>
+        <w:spacing w:before="0" w:after="120" w:line="276" w:lineRule="auto"/>
       </w:pPr>
       <w:r>
         <w:rPr>
@@ -1464,7 +1423,7 @@
     </w:p>
     <w:p>
       <w:pPr>
-        <w:spacing w:line="300" w:lineRule="auto" w:after="120"/>
+        <w:spacing w:before="0" w:after="120" w:line="276" w:lineRule="auto"/>
       </w:pPr>
       <w:r>
         <w:rPr>
@@ -1477,7 +1436,7 @@
     </w:p>
     <w:p>
       <w:pPr>
-        <w:spacing w:line="300" w:lineRule="auto" w:after="120"/>
+        <w:spacing w:before="0" w:after="120" w:line="276" w:lineRule="auto"/>
       </w:pPr>
       <w:r>
         <w:rPr>
@@ -1490,7 +1449,7 @@
     </w:p>
     <w:p>
       <w:pPr>
-        <w:spacing w:line="300" w:lineRule="auto" w:after="120"/>
+        <w:spacing w:before="0" w:after="120" w:line="276" w:lineRule="auto"/>
       </w:pPr>
       <w:r>
         <w:rPr>
@@ -1503,7 +1462,7 @@
     </w:p>
     <w:p>
       <w:pPr>
-        <w:spacing w:line="300" w:lineRule="auto" w:after="120"/>
+        <w:spacing w:before="0" w:after="120" w:line="276" w:lineRule="auto"/>
       </w:pPr>
       <w:r>
         <w:rPr>
@@ -1516,7 +1475,7 @@
     </w:p>
     <w:p>
       <w:pPr>
-        <w:spacing w:line="300" w:lineRule="auto" w:after="120"/>
+        <w:spacing w:before="0" w:after="120" w:line="276" w:lineRule="auto"/>
       </w:pPr>
       <w:r>
         <w:rPr>
@@ -1529,7 +1488,7 @@
     </w:p>
     <w:p>
       <w:pPr>
-        <w:spacing w:line="300" w:lineRule="auto" w:after="120"/>
+        <w:spacing w:before="0" w:after="120" w:line="276" w:lineRule="auto"/>
       </w:pPr>
       <w:r>
         <w:rPr>
@@ -1542,7 +1501,7 @@
     </w:p>
     <w:p>
       <w:pPr>
-        <w:spacing w:line="300" w:lineRule="auto" w:after="120"/>
+        <w:spacing w:before="0" w:after="120" w:line="276" w:lineRule="auto"/>
       </w:pPr>
       <w:r>
         <w:rPr>
@@ -1555,7 +1514,7 @@
     </w:p>
     <w:p>
       <w:pPr>
-        <w:spacing w:line="300" w:lineRule="auto" w:after="120"/>
+        <w:spacing w:before="0" w:after="120" w:line="276" w:lineRule="auto"/>
       </w:pPr>
       <w:r>
         <w:rPr>
@@ -1568,7 +1527,7 @@
     </w:p>
     <w:p>
       <w:pPr>
-        <w:spacing w:line="300" w:lineRule="auto" w:after="120"/>
+        <w:spacing w:before="0" w:after="120" w:line="276" w:lineRule="auto"/>
       </w:pPr>
       <w:r>
         <w:rPr>
@@ -1581,7 +1540,7 @@
     </w:p>
     <w:p>
       <w:pPr>
-        <w:spacing w:line="300" w:lineRule="auto" w:after="120"/>
+        <w:spacing w:before="0" w:after="120" w:line="276" w:lineRule="auto"/>
       </w:pPr>
       <w:r>
         <w:rPr>
@@ -1594,7 +1553,7 @@
     </w:p>
     <w:p>
       <w:pPr>
-        <w:spacing w:line="300" w:lineRule="auto" w:after="120"/>
+        <w:spacing w:before="0" w:after="120" w:line="276" w:lineRule="auto"/>
       </w:pPr>
       <w:r>
         <w:rPr>
@@ -1607,7 +1566,7 @@
     </w:p>
     <w:p>
       <w:pPr>
-        <w:spacing w:line="300" w:lineRule="auto" w:after="120"/>
+        <w:spacing w:before="0" w:after="120" w:line="276" w:lineRule="auto"/>
       </w:pPr>
       <w:r>
         <w:rPr>
@@ -1620,7 +1579,7 @@
     </w:p>
     <w:p>
       <w:pPr>
-        <w:spacing w:line="300" w:lineRule="auto" w:after="120"/>
+        <w:spacing w:before="0" w:after="120" w:line="276" w:lineRule="auto"/>
       </w:pPr>
       <w:r>
         <w:rPr>
@@ -1633,7 +1592,7 @@
     </w:p>
     <w:p>
       <w:pPr>
-        <w:spacing w:line="300" w:lineRule="auto" w:after="120"/>
+        <w:spacing w:before="0" w:after="120" w:line="276" w:lineRule="auto"/>
       </w:pPr>
       <w:r>
         <w:rPr>
@@ -1646,7 +1605,7 @@
     </w:p>
     <w:p>
       <w:pPr>
-        <w:spacing w:line="300" w:lineRule="auto" w:after="120"/>
+        <w:spacing w:before="0" w:after="120" w:line="276" w:lineRule="auto"/>
       </w:pPr>
       <w:r>
         <w:rPr>
@@ -1659,7 +1618,7 @@
     </w:p>
     <w:p>
       <w:pPr>
-        <w:spacing w:line="300" w:lineRule="auto" w:after="120"/>
+        <w:spacing w:before="0" w:after="120" w:line="276" w:lineRule="auto"/>
       </w:pPr>
       <w:r>
         <w:rPr>
@@ -1672,7 +1631,7 @@
     </w:p>
     <w:p>
       <w:pPr>
-        <w:spacing w:line="300" w:lineRule="auto" w:after="120"/>
+        <w:spacing w:before="0" w:after="120" w:line="276" w:lineRule="auto"/>
       </w:pPr>
       <w:r>
         <w:rPr>
@@ -1685,7 +1644,7 @@
     </w:p>
     <w:p>
       <w:pPr>
-        <w:spacing w:line="300" w:lineRule="auto" w:after="120"/>
+        <w:spacing w:before="0" w:after="120" w:line="276" w:lineRule="auto"/>
       </w:pPr>
       <w:r>
         <w:rPr>
@@ -1698,7 +1657,7 @@
     </w:p>
     <w:p>
       <w:pPr>
-        <w:spacing w:line="300" w:lineRule="auto" w:after="120"/>
+        <w:spacing w:before="0" w:after="120" w:line="276" w:lineRule="auto"/>
       </w:pPr>
       <w:r>
         <w:rPr>
@@ -1711,7 +1670,7 @@
     </w:p>
     <w:p>
       <w:pPr>
-        <w:spacing w:line="300" w:lineRule="auto" w:after="120"/>
+        <w:spacing w:before="0" w:after="120" w:line="276" w:lineRule="auto"/>
       </w:pPr>
       <w:r>
         <w:rPr>
@@ -1724,7 +1683,7 @@
     </w:p>
     <w:p>
       <w:pPr>
-        <w:spacing w:line="300" w:lineRule="auto" w:after="120"/>
+        <w:spacing w:before="0" w:after="120" w:line="276" w:lineRule="auto"/>
       </w:pPr>
       <w:r>
         <w:rPr>
@@ -1737,7 +1696,7 @@
     </w:p>
     <w:p>
       <w:pPr>
-        <w:spacing w:line="300" w:lineRule="auto" w:after="120"/>
+        <w:spacing w:before="0" w:after="120" w:line="276" w:lineRule="auto"/>
       </w:pPr>
       <w:r>
         <w:rPr>
@@ -1750,7 +1709,7 @@
     </w:p>
     <w:p>
       <w:pPr>
-        <w:spacing w:line="300" w:lineRule="auto" w:after="120"/>
+        <w:spacing w:before="0" w:after="120" w:line="276" w:lineRule="auto"/>
       </w:pPr>
       <w:r>
         <w:rPr>
@@ -1758,12 +1717,12 @@
           <w:color w:val="222222"/>
           <w:sz w:val="24"/>
         </w:rPr>
-        <w:t>“Nó cũng sẽ chẳng khác mấy so với thường ngày đúng không ạ?” Mahiru đồng tình.</w:t>
+        <w:t>“Nó cũng sẽ chẳng khác mấy so với thường ngày đúng không?” Mahiru đồng tình.</w:t>
       </w:r>
     </w:p>
     <w:p>
       <w:pPr>
-        <w:spacing w:line="300" w:lineRule="auto" w:after="120"/>
+        <w:spacing w:before="0" w:after="120" w:line="276" w:lineRule="auto"/>
       </w:pPr>
       <w:r>
         <w:rPr>
@@ -1776,7 +1735,7 @@
     </w:p>
     <w:p>
       <w:pPr>
-        <w:spacing w:line="300" w:lineRule="auto" w:after="120"/>
+        <w:spacing w:before="0" w:after="120" w:line="276" w:lineRule="auto"/>
       </w:pPr>
       <w:r>
         <w:rPr>
@@ -1789,7 +1748,7 @@
     </w:p>
     <w:p>
       <w:pPr>
-        <w:spacing w:line="300" w:lineRule="auto" w:after="120"/>
+        <w:spacing w:before="0" w:after="120" w:line="276" w:lineRule="auto"/>
       </w:pPr>
       <w:r>
         <w:rPr>
@@ -1802,7 +1761,7 @@
     </w:p>
     <w:p>
       <w:pPr>
-        <w:spacing w:line="300" w:lineRule="auto" w:after="120"/>
+        <w:spacing w:before="0" w:after="120" w:line="276" w:lineRule="auto"/>
       </w:pPr>
       <w:r>
         <w:rPr>
@@ -1815,7 +1774,7 @@
     </w:p>
     <w:p>
       <w:pPr>
-        <w:spacing w:line="300" w:lineRule="auto" w:after="120"/>
+        <w:spacing w:before="0" w:after="120" w:line="276" w:lineRule="auto"/>
       </w:pPr>
       <w:r>
         <w:rPr>
@@ -1828,7 +1787,7 @@
     </w:p>
     <w:p>
       <w:pPr>
-        <w:spacing w:line="300" w:lineRule="auto" w:after="120"/>
+        <w:spacing w:before="0" w:after="120" w:line="276" w:lineRule="auto"/>
       </w:pPr>
       <w:r>
         <w:rPr>
@@ -1841,7 +1800,7 @@
     </w:p>
     <w:p>
       <w:pPr>
-        <w:spacing w:line="300" w:lineRule="auto" w:after="120"/>
+        <w:spacing w:before="0" w:after="120" w:line="276" w:lineRule="auto"/>
       </w:pPr>
       <w:r>
         <w:rPr>
@@ -1854,7 +1813,7 @@
     </w:p>
     <w:p>
       <w:pPr>
-        <w:spacing w:line="300" w:lineRule="auto" w:after="120"/>
+        <w:spacing w:before="0" w:after="120" w:line="276" w:lineRule="auto"/>
       </w:pPr>
       <w:r>
         <w:rPr>
@@ -1862,12 +1821,12 @@
           <w:color w:val="222222"/>
           <w:sz w:val="24"/>
         </w:rPr>
-        <w:t>“Năm nay Chitose-san có kế hoạch đi chơi cùng nhau không ạ?”</w:t>
+        <w:t>“Năm nay Chitose có kế hoạch đi chơi cùng nhau không?”</w:t>
       </w:r>
     </w:p>
     <w:p>
       <w:pPr>
-        <w:spacing w:line="300" w:lineRule="auto" w:after="120"/>
+        <w:spacing w:before="0" w:after="120" w:line="276" w:lineRule="auto"/>
       </w:pPr>
       <w:r>
         <w:rPr>
@@ -1880,7 +1839,7 @@
     </w:p>
     <w:p>
       <w:pPr>
-        <w:spacing w:line="300" w:lineRule="auto" w:after="120"/>
+        <w:spacing w:before="0" w:after="120" w:line="276" w:lineRule="auto"/>
       </w:pPr>
       <w:r>
         <w:rPr>
@@ -1893,7 +1852,7 @@
     </w:p>
     <w:p>
       <w:pPr>
-        <w:spacing w:line="300" w:lineRule="auto" w:after="120"/>
+        <w:spacing w:before="0" w:after="120" w:line="276" w:lineRule="auto"/>
       </w:pPr>
       <w:r>
         <w:rPr>
@@ -1906,7 +1865,7 @@
     </w:p>
     <w:p>
       <w:pPr>
-        <w:spacing w:line="300" w:lineRule="auto" w:after="120"/>
+        <w:spacing w:before="0" w:after="120" w:line="276" w:lineRule="auto"/>
       </w:pPr>
       <w:r>
         <w:rPr>
@@ -1914,12 +1873,12 @@
           <w:color w:val="222222"/>
           <w:sz w:val="24"/>
         </w:rPr>
-        <w:t>“…Nếu mọi người đều thấy ổn, tớ nghĩ việc dành một trong hai ngày để ở bên nhau cả nhóm sẽ rất vui đấy ạ. Dĩ nhiên nếu hai cậu đã có kế hoạch hẹn hò riêng thì điều đó nên được ưu tiên hàng đầu.”</w:t>
+        <w:t>“…Nếu mọi người đều thấy ổn, tớ nghĩ việc dành một trong hai ngày để ở bên nhau cả nhóm sẽ rất vui đấy chứ. Dĩ nhiên nếu hai cậu đã có kế hoạch hẹn hò riêng thì điều đó nên được ưu tiên hàng đầu.”</w:t>
       </w:r>
     </w:p>
     <w:p>
       <w:pPr>
-        <w:spacing w:line="300" w:lineRule="auto" w:after="120"/>
+        <w:spacing w:before="0" w:after="120" w:line="276" w:lineRule="auto"/>
       </w:pPr>
       <w:r>
         <w:rPr>
@@ -1932,7 +1891,7 @@
     </w:p>
     <w:p>
       <w:pPr>
-        <w:spacing w:line="300" w:lineRule="auto" w:after="120"/>
+        <w:spacing w:before="0" w:after="120" w:line="276" w:lineRule="auto"/>
       </w:pPr>
       <w:r>
         <w:rPr>
@@ -1945,7 +1904,7 @@
     </w:p>
     <w:p>
       <w:pPr>
-        <w:spacing w:line="300" w:lineRule="auto" w:after="120"/>
+        <w:spacing w:before="0" w:after="120" w:line="276" w:lineRule="auto"/>
       </w:pPr>
       <w:r>
         <w:rPr>
@@ -1958,7 +1917,7 @@
     </w:p>
     <w:p>
       <w:pPr>
-        <w:spacing w:line="300" w:lineRule="auto" w:after="120"/>
+        <w:spacing w:before="0" w:after="120" w:line="276" w:lineRule="auto"/>
       </w:pPr>
       <w:r>
         <w:rPr>
@@ -1971,7 +1930,7 @@
     </w:p>
     <w:p>
       <w:pPr>
-        <w:spacing w:line="300" w:lineRule="auto" w:after="120"/>
+        <w:spacing w:before="0" w:after="120" w:line="276" w:lineRule="auto"/>
       </w:pPr>
       <w:r>
         <w:rPr>
@@ -1984,7 +1943,7 @@
     </w:p>
     <w:p>
       <w:pPr>
-        <w:spacing w:line="300" w:lineRule="auto" w:after="120"/>
+        <w:spacing w:before="0" w:after="120" w:line="276" w:lineRule="auto"/>
       </w:pPr>
       <w:r>
         <w:rPr>
@@ -1997,7 +1956,7 @@
     </w:p>
     <w:p>
       <w:pPr>
-        <w:spacing w:line="300" w:lineRule="auto" w:after="120"/>
+        <w:spacing w:before="0" w:after="120" w:line="276" w:lineRule="auto"/>
       </w:pPr>
       <w:r>
         <w:rPr>
@@ -2010,7 +1969,7 @@
     </w:p>
     <w:p>
       <w:pPr>
-        <w:spacing w:line="300" w:lineRule="auto" w:after="120"/>
+        <w:spacing w:before="0" w:after="120" w:line="276" w:lineRule="auto"/>
       </w:pPr>
       <w:r>
         <w:rPr>
@@ -2023,7 +1982,7 @@
     </w:p>
     <w:p>
       <w:pPr>
-        <w:spacing w:line="300" w:lineRule="auto" w:after="120"/>
+        <w:spacing w:before="0" w:after="120" w:line="276" w:lineRule="auto"/>
       </w:pPr>
       <w:r>
         <w:rPr>
@@ -2036,7 +1995,7 @@
     </w:p>
     <w:p>
       <w:pPr>
-        <w:spacing w:line="300" w:lineRule="auto" w:after="120"/>
+        <w:spacing w:before="0" w:after="120" w:line="276" w:lineRule="auto"/>
       </w:pPr>
       <w:r>
         <w:rPr>
@@ -2049,7 +2008,7 @@
     </w:p>
     <w:p>
       <w:pPr>
-        <w:spacing w:line="300" w:lineRule="auto" w:after="120"/>
+        <w:spacing w:before="0" w:after="120" w:line="276" w:lineRule="auto"/>
       </w:pPr>
       <w:r>
         <w:rPr>
@@ -2062,7 +2021,7 @@
     </w:p>
     <w:p>
       <w:pPr>
-        <w:spacing w:line="300" w:lineRule="auto" w:after="120"/>
+        <w:spacing w:before="0" w:after="120" w:line="276" w:lineRule="auto"/>
       </w:pPr>
       <w:r>
         <w:rPr>
@@ -2075,7 +2034,7 @@
     </w:p>
     <w:p>
       <w:pPr>
-        <w:spacing w:line="300" w:lineRule="auto" w:after="120"/>
+        <w:spacing w:before="0" w:after="120" w:line="276" w:lineRule="auto"/>
       </w:pPr>
       <w:r>
         <w:rPr>
@@ -2088,7 +2047,7 @@
     </w:p>
     <w:p>
       <w:pPr>
-        <w:spacing w:line="300" w:lineRule="auto" w:after="120"/>
+        <w:spacing w:before="0" w:after="120" w:line="276" w:lineRule="auto"/>
       </w:pPr>
       <w:r>
         <w:rPr>
@@ -2101,7 +2060,7 @@
     </w:p>
     <w:p>
       <w:pPr>
-        <w:spacing w:line="300" w:lineRule="auto" w:after="120"/>
+        <w:spacing w:before="0" w:after="120" w:line="276" w:lineRule="auto"/>
       </w:pPr>
       <w:r>
         <w:rPr>
@@ -2114,7 +2073,7 @@
     </w:p>
     <w:p>
       <w:pPr>
-        <w:spacing w:line="300" w:lineRule="auto" w:after="120"/>
+        <w:spacing w:before="0" w:after="120" w:line="276" w:lineRule="auto"/>
       </w:pPr>
       <w:r>
         <w:rPr>
@@ -2127,7 +2086,7 @@
     </w:p>
     <w:p>
       <w:pPr>
-        <w:spacing w:line="300" w:lineRule="auto" w:after="120"/>
+        <w:spacing w:before="0" w:after="120" w:line="276" w:lineRule="auto"/>
       </w:pPr>
       <w:r>
         <w:rPr>
@@ -2140,7 +2099,7 @@
     </w:p>
     <w:p>
       <w:pPr>
-        <w:spacing w:line="300" w:lineRule="auto" w:after="120"/>
+        <w:spacing w:before="0" w:after="120" w:line="276" w:lineRule="auto"/>
       </w:pPr>
       <w:r>
         <w:rPr>
@@ -2153,7 +2112,7 @@
     </w:p>
     <w:p>
       <w:pPr>
-        <w:spacing w:line="300" w:lineRule="auto" w:after="120"/>
+        <w:spacing w:before="0" w:after="120" w:line="276" w:lineRule="auto"/>
       </w:pPr>
       <w:r>
         <w:rPr>
@@ -2166,7 +2125,7 @@
     </w:p>
     <w:p>
       <w:pPr>
-        <w:spacing w:line="300" w:lineRule="auto" w:after="120"/>
+        <w:spacing w:before="0" w:after="120" w:line="276" w:lineRule="auto"/>
       </w:pPr>
       <w:r>
         <w:rPr>
@@ -2179,7 +2138,7 @@
     </w:p>
     <w:p>
       <w:pPr>
-        <w:spacing w:line="300" w:lineRule="auto" w:after="120"/>
+        <w:spacing w:before="0" w:after="120" w:line="276" w:lineRule="auto"/>
       </w:pPr>
       <w:r>
         <w:rPr>
@@ -2192,7 +2151,7 @@
     </w:p>
     <w:p>
       <w:pPr>
-        <w:spacing w:line="300" w:lineRule="auto" w:after="120"/>
+        <w:spacing w:before="0" w:after="120" w:line="276" w:lineRule="auto"/>
       </w:pPr>
       <w:r>
         <w:rPr>
@@ -2205,7 +2164,7 @@
     </w:p>
     <w:p>
       <w:pPr>
-        <w:spacing w:line="300" w:lineRule="auto" w:after="120"/>
+        <w:spacing w:before="0" w:after="120" w:line="276" w:lineRule="auto"/>
       </w:pPr>
       <w:r>
         <w:rPr>
@@ -2218,7 +2177,7 @@
     </w:p>
     <w:p>
       <w:pPr>
-        <w:spacing w:line="300" w:lineRule="auto" w:after="120"/>
+        <w:spacing w:before="0" w:after="120" w:line="276" w:lineRule="auto"/>
       </w:pPr>
       <w:r>
         <w:rPr>
@@ -2231,7 +2190,7 @@
     </w:p>
     <w:p>
       <w:pPr>
-        <w:spacing w:line="300" w:lineRule="auto" w:after="120"/>
+        <w:spacing w:before="0" w:after="120" w:line="276" w:lineRule="auto"/>
       </w:pPr>
       <w:r>
         <w:rPr>
@@ -2244,7 +2203,7 @@
     </w:p>
     <w:p>
       <w:pPr>
-        <w:spacing w:line="300" w:lineRule="auto" w:after="120"/>
+        <w:spacing w:before="0" w:after="120" w:line="276" w:lineRule="auto"/>
       </w:pPr>
       <w:r>
         <w:rPr>
@@ -2257,7 +2216,7 @@
     </w:p>
     <w:p>
       <w:pPr>
-        <w:spacing w:line="300" w:lineRule="auto" w:after="120"/>
+        <w:spacing w:before="0" w:after="120" w:line="276" w:lineRule="auto"/>
       </w:pPr>
       <w:r>
         <w:rPr>
@@ -2270,7 +2229,7 @@
     </w:p>
     <w:p>
       <w:pPr>
-        <w:spacing w:line="300" w:lineRule="auto" w:after="120"/>
+        <w:spacing w:before="0" w:after="120" w:line="276" w:lineRule="auto"/>
       </w:pPr>
       <w:r>
         <w:rPr>
@@ -2283,7 +2242,7 @@
     </w:p>
     <w:p>
       <w:pPr>
-        <w:spacing w:line="300" w:lineRule="auto" w:after="120"/>
+        <w:spacing w:before="0" w:after="120" w:line="276" w:lineRule="auto"/>
       </w:pPr>
       <w:r>
         <w:rPr>
@@ -2296,7 +2255,7 @@
     </w:p>
     <w:p>
       <w:pPr>
-        <w:spacing w:line="300" w:lineRule="auto" w:after="120"/>
+        <w:spacing w:before="0" w:after="120" w:line="276" w:lineRule="auto"/>
       </w:pPr>
       <w:r>
         <w:rPr>
@@ -2309,7 +2268,7 @@
     </w:p>
     <w:p>
       <w:pPr>
-        <w:spacing w:line="300" w:lineRule="auto" w:after="120"/>
+        <w:spacing w:before="0" w:after="120" w:line="276" w:lineRule="auto"/>
       </w:pPr>
       <w:r>
         <w:rPr>
@@ -2322,7 +2281,7 @@
     </w:p>
     <w:p>
       <w:pPr>
-        <w:spacing w:line="300" w:lineRule="auto" w:after="120"/>
+        <w:spacing w:before="0" w:after="120" w:line="276" w:lineRule="auto"/>
       </w:pPr>
       <w:r>
         <w:rPr>
@@ -2335,7 +2294,7 @@
     </w:p>
     <w:p>
       <w:pPr>
-        <w:spacing w:line="300" w:lineRule="auto" w:after="120"/>
+        <w:spacing w:before="0" w:after="120" w:line="276" w:lineRule="auto"/>
       </w:pPr>
       <w:r>
         <w:rPr>
@@ -2348,7 +2307,7 @@
     </w:p>
     <w:p>
       <w:pPr>
-        <w:spacing w:line="300" w:lineRule="auto" w:after="120"/>
+        <w:spacing w:before="0" w:after="120" w:line="276" w:lineRule="auto"/>
       </w:pPr>
       <w:r>
         <w:rPr>
@@ -2361,7 +2320,7 @@
     </w:p>
     <w:p>
       <w:pPr>
-        <w:spacing w:line="300" w:lineRule="auto" w:after="120"/>
+        <w:spacing w:before="0" w:after="120" w:line="276" w:lineRule="auto"/>
       </w:pPr>
       <w:r>
         <w:rPr>
@@ -2374,7 +2333,7 @@
     </w:p>
     <w:p>
       <w:pPr>
-        <w:spacing w:line="300" w:lineRule="auto" w:after="120"/>
+        <w:spacing w:before="0" w:after="120" w:line="276" w:lineRule="auto"/>
       </w:pPr>
       <w:r>
         <w:rPr>
@@ -2387,7 +2346,7 @@
     </w:p>
     <w:p>
       <w:pPr>
-        <w:spacing w:line="300" w:lineRule="auto" w:after="120"/>
+        <w:spacing w:before="0" w:after="120" w:line="276" w:lineRule="auto"/>
       </w:pPr>
       <w:r>
         <w:rPr>
@@ -2400,7 +2359,7 @@
     </w:p>
     <w:p>
       <w:pPr>
-        <w:spacing w:line="300" w:lineRule="auto" w:after="120"/>
+        <w:spacing w:before="0" w:after="120" w:line="276" w:lineRule="auto"/>
       </w:pPr>
       <w:r>
         <w:rPr>
@@ -2413,7 +2372,7 @@
     </w:p>
     <w:p>
       <w:pPr>
-        <w:spacing w:line="300" w:lineRule="auto" w:after="120"/>
+        <w:spacing w:before="0" w:after="120" w:line="276" w:lineRule="auto"/>
       </w:pPr>
       <w:r>
         <w:rPr>
@@ -2426,7 +2385,7 @@
     </w:p>
     <w:p>
       <w:pPr>
-        <w:spacing w:line="300" w:lineRule="auto" w:after="120"/>
+        <w:spacing w:before="0" w:after="120" w:line="276" w:lineRule="auto"/>
       </w:pPr>
       <w:r>
         <w:rPr>
@@ -2439,7 +2398,7 @@
     </w:p>
     <w:p>
       <w:pPr>
-        <w:spacing w:line="300" w:lineRule="auto" w:after="120"/>
+        <w:spacing w:before="0" w:after="120" w:line="276" w:lineRule="auto"/>
       </w:pPr>
       <w:r>
         <w:rPr>
@@ -2452,7 +2411,7 @@
     </w:p>
     <w:p>
       <w:pPr>
-        <w:spacing w:line="300" w:lineRule="auto" w:after="120"/>
+        <w:spacing w:before="0" w:after="120" w:line="276" w:lineRule="auto"/>
       </w:pPr>
       <w:r>
         <w:rPr>
@@ -2465,7 +2424,7 @@
     </w:p>
     <w:p>
       <w:pPr>
-        <w:spacing w:line="300" w:lineRule="auto" w:after="120"/>
+        <w:spacing w:before="0" w:after="120" w:line="276" w:lineRule="auto"/>
       </w:pPr>
       <w:r>
         <w:rPr>
@@ -2478,7 +2437,7 @@
     </w:p>
     <w:p>
       <w:pPr>
-        <w:spacing w:line="300" w:lineRule="auto" w:after="120"/>
+        <w:spacing w:before="0" w:after="120" w:line="276" w:lineRule="auto"/>
       </w:pPr>
       <w:r>
         <w:rPr>
@@ -2491,7 +2450,7 @@
     </w:p>
     <w:p>
       <w:pPr>
-        <w:spacing w:line="300" w:lineRule="auto" w:after="120"/>
+        <w:spacing w:before="0" w:after="120" w:line="276" w:lineRule="auto"/>
       </w:pPr>
       <w:r>
         <w:rPr>
@@ -2504,7 +2463,7 @@
     </w:p>
     <w:sectPr>
       <w:pgSz w:w="12240" w:h="15840"/>
-      <w:pgMar w:top="1440" w:right="1800" w:bottom="1440" w:left="1800" w:header="720" w:footer="720" w:gutter="0"/>
+      <w:pgMar w:top="1440" w:right="1440" w:bottom="1440" w:left="1440" w:header="720" w:footer="720" w:gutter="0"/>
       <w:cols w:space="720"/>
       <w:docGrid w:linePitch="360"/>
     </w:sectPr>

</xml_diff>